<commit_message>
fix(legal): correct name spelling עמיחי (not אמיחי) in Hebrew docs
Co-Authored-By: Claude Sonnet 4.6 <noreply@anthropic.com>
</commit_message>
<xml_diff>
--- a/LEGAL/מבנה_משפטי_ותאגידי.docx
+++ b/LEGAL/מבנה_משפטי_ותאגידי.docx
@@ -46,7 +46,7 @@
           <w:rtl/>
           <w:lang w:bidi="he-IL"/>
         </w:rPr>
-        <w:t>תאריך עריכה: יוני 2026   |   מוכן על ידי: אמיחי קרופיק, מייסד   |   סטטוס: טיוטת עבודה</w:t>
+        <w:t>תאריך עריכה: יוני 2026   |   מוכן על ידי: עמיחי קרופיק, מייסד   |   סטטוס: טיוטת עבודה</w:t>
       </w:r>
     </w:p>
     <w:p>
@@ -402,7 +402,7 @@
                 <w:rtl/>
                 <w:lang w:bidi="he-IL"/>
               </w:rPr>
-              <w:t>100% — אמיחי קרופיק</w:t>
+              <w:t>100% — עמיחי קרופיק</w:t>
             </w:r>
           </w:p>
         </w:tc>
@@ -688,7 +688,7 @@
                 <w:rtl/>
                 <w:lang w:bidi="he-IL"/>
               </w:rPr>
-              <w:t>אמיחי קרופיק</w:t>
+              <w:t>עמיחי קרופיק</w:t>
             </w:r>
           </w:p>
         </w:tc>
@@ -765,7 +765,7 @@
           <w:rtl/>
           <w:lang w:bidi="he-IL"/>
         </w:rPr>
-        <w:t>אמיחי קרופיק (פרט)</w:t>
+        <w:t>עמיחי קרופיק (פרט)</w:t>
         <w:br/>
         <w:t xml:space="preserve">          |</w:t>
         <w:br/>

</xml_diff>

<commit_message>
legal(he): add 3 missing sections to Hebrew executive summary
- §5.3: website ownership (vigmis.com = Taurus) + full tech stack table
  showing all engines/data/ops run on Taurus infrastructure
- §7.3: VAT/GST handling via Stripe Tax — EU OSS, UK VAT, US Sales Tax,
  responsibility split (VIGMIS US files, Stripe collects, Taurus = B2B only)
- §7.4: Transfer Pricing (renumbered from 7.3)

Co-Authored-By: Claude Sonnet 4.6 <noreply@anthropic.com>
</commit_message>
<xml_diff>
--- a/LEGAL/מבנה_משפטי_ותאגידי.docx
+++ b/LEGAL/מבנה_משפטי_ותאגידי.docx
@@ -1662,6 +1662,657 @@
     </w:tbl>
     <w:p/>
     <w:p>
+      <w:pPr>
+        <w:pStyle w:val="Heading2"/>
+        <w:bidi/>
+        <w:jc w:val="right"/>
+      </w:pPr>
+      <w:r>
+        <w:rPr>
+          <w:rFonts w:ascii="Arial" w:hAnsi="Arial"/>
+          <w:rtl/>
+          <w:lang w:bidi="he-IL"/>
+        </w:rPr>
+        <w:t>5.3 הבסיס הטכנולוגי — כולו בטאורוס</w:t>
+      </w:r>
+    </w:p>
+    <w:p>
+      <w:pPr>
+        <w:spacing w:after="120"/>
+        <w:bidi/>
+        <w:jc w:val="right"/>
+      </w:pPr>
+      <w:r>
+        <w:rPr>
+          <w:rFonts w:ascii="Arial" w:hAnsi="Arial"/>
+          <w:b w:val="0"/>
+          <w:i w:val="0"/>
+          <w:sz w:val="22"/>
+          <w:rtl/>
+          <w:lang w:bidi="he-IL"/>
+        </w:rPr>
+        <w:t>האתר vigmis.com — הדומיין, התוכן, הקוד, ועיצוב הממשק — שייכים לטאורוס. VIGMIS US LLC אינה בעלת האתר. VIGMIS US מורשית להשתמש בשם ובמותג לצורכי שיווק ומכירות בלבד (ראה הסכם בין-חברתי).</w:t>
+      </w:r>
+    </w:p>
+    <w:p>
+      <w:pPr>
+        <w:spacing w:after="120"/>
+        <w:bidi/>
+        <w:jc w:val="right"/>
+      </w:pPr>
+      <w:r>
+        <w:rPr>
+          <w:rFonts w:ascii="Arial" w:hAnsi="Arial"/>
+          <w:b w:val="0"/>
+          <w:i w:val="0"/>
+          <w:sz w:val="22"/>
+          <w:rtl/>
+          <w:lang w:bidi="he-IL"/>
+        </w:rPr>
+        <w:t>כל המנועים הטכנולוגיים פועלים בתשתית טאורוס:</w:t>
+      </w:r>
+    </w:p>
+    <w:tbl>
+      <w:tblPr>
+        <w:tblStyle w:val="TableGrid"/>
+        <w:tblW w:type="auto" w:w="0"/>
+        <w:tblLook w:firstColumn="1" w:firstRow="1" w:lastColumn="0" w:lastRow="0" w:noHBand="0" w:noVBand="1" w:val="04A0"/>
+      </w:tblPr>
+      <w:tblGrid>
+        <w:gridCol w:w="2835"/>
+        <w:gridCol w:w="2835"/>
+        <w:gridCol w:w="2835"/>
+      </w:tblGrid>
+      <w:tr>
+        <w:tc>
+          <w:tcPr>
+            <w:tcW w:type="dxa" w:w="2835"/>
+          </w:tcPr>
+          <w:p>
+            <w:pPr>
+              <w:bidi/>
+              <w:jc w:val="right"/>
+            </w:pPr>
+            <w:r>
+              <w:rPr>
+                <w:rFonts w:ascii="Arial" w:hAnsi="Arial"/>
+                <w:b/>
+                <w:sz w:val="20"/>
+                <w:rtl/>
+                <w:lang w:bidi="he-IL"/>
+              </w:rPr>
+              <w:t>רכיב</w:t>
+            </w:r>
+          </w:p>
+        </w:tc>
+        <w:tc>
+          <w:tcPr>
+            <w:tcW w:type="dxa" w:w="2835"/>
+          </w:tcPr>
+          <w:p>
+            <w:pPr>
+              <w:bidi/>
+              <w:jc w:val="right"/>
+            </w:pPr>
+            <w:r>
+              <w:rPr>
+                <w:rFonts w:ascii="Arial" w:hAnsi="Arial"/>
+                <w:b/>
+                <w:sz w:val="20"/>
+                <w:rtl/>
+                <w:lang w:bidi="he-IL"/>
+              </w:rPr>
+              <w:t>מיקום</w:t>
+            </w:r>
+          </w:p>
+        </w:tc>
+        <w:tc>
+          <w:tcPr>
+            <w:tcW w:type="dxa" w:w="2835"/>
+          </w:tcPr>
+          <w:p>
+            <w:pPr>
+              <w:bidi/>
+              <w:jc w:val="right"/>
+            </w:pPr>
+            <w:r>
+              <w:rPr>
+                <w:rFonts w:ascii="Arial" w:hAnsi="Arial"/>
+                <w:b/>
+                <w:sz w:val="20"/>
+                <w:rtl/>
+                <w:lang w:bidi="he-IL"/>
+              </w:rPr>
+              <w:t>בעלות</w:t>
+            </w:r>
+          </w:p>
+        </w:tc>
+      </w:tr>
+      <w:tr>
+        <w:tc>
+          <w:tcPr>
+            <w:tcW w:type="dxa" w:w="2835"/>
+          </w:tcPr>
+          <w:p>
+            <w:pPr>
+              <w:bidi/>
+              <w:jc w:val="right"/>
+            </w:pPr>
+            <w:r>
+              <w:rPr>
+                <w:rFonts w:ascii="Arial" w:hAnsi="Arial"/>
+                <w:b/>
+                <w:sz w:val="20"/>
+                <w:rtl/>
+                <w:lang w:bidi="he-IL"/>
+              </w:rPr>
+              <w:t>קוד המוצר</w:t>
+            </w:r>
+          </w:p>
+        </w:tc>
+        <w:tc>
+          <w:tcPr>
+            <w:tcW w:type="dxa" w:w="2835"/>
+          </w:tcPr>
+          <w:p>
+            <w:pPr>
+              <w:bidi/>
+              <w:jc w:val="right"/>
+            </w:pPr>
+            <w:r>
+              <w:rPr>
+                <w:rFonts w:ascii="Arial" w:hAnsi="Arial"/>
+                <w:sz w:val="20"/>
+                <w:rtl/>
+                <w:lang w:bidi="he-IL"/>
+              </w:rPr>
+              <w:t>Railway (שרתים)</w:t>
+            </w:r>
+          </w:p>
+        </w:tc>
+        <w:tc>
+          <w:tcPr>
+            <w:tcW w:type="dxa" w:w="2835"/>
+          </w:tcPr>
+          <w:p>
+            <w:pPr>
+              <w:bidi/>
+              <w:jc w:val="right"/>
+            </w:pPr>
+            <w:r>
+              <w:rPr>
+                <w:rFonts w:ascii="Arial" w:hAnsi="Arial"/>
+                <w:sz w:val="20"/>
+                <w:rtl/>
+                <w:lang w:bidi="he-IL"/>
+              </w:rPr>
+              <w:t>טאורוס</w:t>
+            </w:r>
+          </w:p>
+        </w:tc>
+      </w:tr>
+      <w:tr>
+        <w:tc>
+          <w:tcPr>
+            <w:tcW w:type="dxa" w:w="2835"/>
+          </w:tcPr>
+          <w:p>
+            <w:pPr>
+              <w:bidi/>
+              <w:jc w:val="right"/>
+            </w:pPr>
+            <w:r>
+              <w:rPr>
+                <w:rFonts w:ascii="Arial" w:hAnsi="Arial"/>
+                <w:b/>
+                <w:sz w:val="20"/>
+                <w:rtl/>
+                <w:lang w:bidi="he-IL"/>
+              </w:rPr>
+              <w:t>מסד נתונים (Supabase)</w:t>
+            </w:r>
+          </w:p>
+        </w:tc>
+        <w:tc>
+          <w:tcPr>
+            <w:tcW w:type="dxa" w:w="2835"/>
+          </w:tcPr>
+          <w:p>
+            <w:pPr>
+              <w:bidi/>
+              <w:jc w:val="right"/>
+            </w:pPr>
+            <w:r>
+              <w:rPr>
+                <w:rFonts w:ascii="Arial" w:hAnsi="Arial"/>
+                <w:sz w:val="20"/>
+                <w:rtl/>
+                <w:lang w:bidi="he-IL"/>
+              </w:rPr>
+              <w:t>ענן EU/US</w:t>
+            </w:r>
+          </w:p>
+        </w:tc>
+        <w:tc>
+          <w:tcPr>
+            <w:tcW w:type="dxa" w:w="2835"/>
+          </w:tcPr>
+          <w:p>
+            <w:pPr>
+              <w:bidi/>
+              <w:jc w:val="right"/>
+            </w:pPr>
+            <w:r>
+              <w:rPr>
+                <w:rFonts w:ascii="Arial" w:hAnsi="Arial"/>
+                <w:sz w:val="20"/>
+                <w:rtl/>
+                <w:lang w:bidi="he-IL"/>
+              </w:rPr>
+              <w:t>טאורוס</w:t>
+            </w:r>
+          </w:p>
+        </w:tc>
+      </w:tr>
+      <w:tr>
+        <w:tc>
+          <w:tcPr>
+            <w:tcW w:type="dxa" w:w="2835"/>
+          </w:tcPr>
+          <w:p>
+            <w:pPr>
+              <w:bidi/>
+              <w:jc w:val="right"/>
+            </w:pPr>
+            <w:r>
+              <w:rPr>
+                <w:rFonts w:ascii="Arial" w:hAnsi="Arial"/>
+                <w:b/>
+                <w:sz w:val="20"/>
+                <w:rtl/>
+                <w:lang w:bidi="he-IL"/>
+              </w:rPr>
+              <w:t>אחסון קבצים (Cloudflare R2)</w:t>
+            </w:r>
+          </w:p>
+        </w:tc>
+        <w:tc>
+          <w:tcPr>
+            <w:tcW w:type="dxa" w:w="2835"/>
+          </w:tcPr>
+          <w:p>
+            <w:pPr>
+              <w:bidi/>
+              <w:jc w:val="right"/>
+            </w:pPr>
+            <w:r>
+              <w:rPr>
+                <w:rFonts w:ascii="Arial" w:hAnsi="Arial"/>
+                <w:sz w:val="20"/>
+                <w:rtl/>
+                <w:lang w:bidi="he-IL"/>
+              </w:rPr>
+              <w:t>ענן גלובלי</w:t>
+            </w:r>
+          </w:p>
+        </w:tc>
+        <w:tc>
+          <w:tcPr>
+            <w:tcW w:type="dxa" w:w="2835"/>
+          </w:tcPr>
+          <w:p>
+            <w:pPr>
+              <w:bidi/>
+              <w:jc w:val="right"/>
+            </w:pPr>
+            <w:r>
+              <w:rPr>
+                <w:rFonts w:ascii="Arial" w:hAnsi="Arial"/>
+                <w:sz w:val="20"/>
+                <w:rtl/>
+                <w:lang w:bidi="he-IL"/>
+              </w:rPr>
+              <w:t>טאורוס</w:t>
+            </w:r>
+          </w:p>
+        </w:tc>
+      </w:tr>
+      <w:tr>
+        <w:tc>
+          <w:tcPr>
+            <w:tcW w:type="dxa" w:w="2835"/>
+          </w:tcPr>
+          <w:p>
+            <w:pPr>
+              <w:bidi/>
+              <w:jc w:val="right"/>
+            </w:pPr>
+            <w:r>
+              <w:rPr>
+                <w:rFonts w:ascii="Arial" w:hAnsi="Arial"/>
+                <w:b/>
+                <w:sz w:val="20"/>
+                <w:rtl/>
+                <w:lang w:bidi="he-IL"/>
+              </w:rPr>
+              <w:t>מנועי AI (OpenAI, Anthropic)</w:t>
+            </w:r>
+          </w:p>
+        </w:tc>
+        <w:tc>
+          <w:tcPr>
+            <w:tcW w:type="dxa" w:w="2835"/>
+          </w:tcPr>
+          <w:p>
+            <w:pPr>
+              <w:bidi/>
+              <w:jc w:val="right"/>
+            </w:pPr>
+            <w:r>
+              <w:rPr>
+                <w:rFonts w:ascii="Arial" w:hAnsi="Arial"/>
+                <w:sz w:val="20"/>
+                <w:rtl/>
+                <w:lang w:bidi="he-IL"/>
+              </w:rPr>
+              <w:t>ספקי צד שלישי — חוזה עם טאורוס</w:t>
+            </w:r>
+          </w:p>
+        </w:tc>
+        <w:tc>
+          <w:tcPr>
+            <w:tcW w:type="dxa" w:w="2835"/>
+          </w:tcPr>
+          <w:p>
+            <w:pPr>
+              <w:bidi/>
+              <w:jc w:val="right"/>
+            </w:pPr>
+            <w:r>
+              <w:rPr>
+                <w:rFonts w:ascii="Arial" w:hAnsi="Arial"/>
+                <w:sz w:val="20"/>
+                <w:rtl/>
+                <w:lang w:bidi="he-IL"/>
+              </w:rPr>
+              <w:t>טאורוס</w:t>
+            </w:r>
+          </w:p>
+        </w:tc>
+      </w:tr>
+      <w:tr>
+        <w:tc>
+          <w:tcPr>
+            <w:tcW w:type="dxa" w:w="2835"/>
+          </w:tcPr>
+          <w:p>
+            <w:pPr>
+              <w:bidi/>
+              <w:jc w:val="right"/>
+            </w:pPr>
+            <w:r>
+              <w:rPr>
+                <w:rFonts w:ascii="Arial" w:hAnsi="Arial"/>
+                <w:b/>
+                <w:sz w:val="20"/>
+                <w:rtl/>
+                <w:lang w:bidi="he-IL"/>
+              </w:rPr>
+              <w:t>Brand DNA Engine, Prompts</w:t>
+            </w:r>
+          </w:p>
+        </w:tc>
+        <w:tc>
+          <w:tcPr>
+            <w:tcW w:type="dxa" w:w="2835"/>
+          </w:tcPr>
+          <w:p>
+            <w:pPr>
+              <w:bidi/>
+              <w:jc w:val="right"/>
+            </w:pPr>
+            <w:r>
+              <w:rPr>
+                <w:rFonts w:ascii="Arial" w:hAnsi="Arial"/>
+                <w:sz w:val="20"/>
+                <w:rtl/>
+                <w:lang w:bidi="he-IL"/>
+              </w:rPr>
+              <w:t>קניין רוחני טאורוס</w:t>
+            </w:r>
+          </w:p>
+        </w:tc>
+        <w:tc>
+          <w:tcPr>
+            <w:tcW w:type="dxa" w:w="2835"/>
+          </w:tcPr>
+          <w:p>
+            <w:pPr>
+              <w:bidi/>
+              <w:jc w:val="right"/>
+            </w:pPr>
+            <w:r>
+              <w:rPr>
+                <w:rFonts w:ascii="Arial" w:hAnsi="Arial"/>
+                <w:sz w:val="20"/>
+                <w:rtl/>
+                <w:lang w:bidi="he-IL"/>
+              </w:rPr>
+              <w:t>טאורוס</w:t>
+            </w:r>
+          </w:p>
+        </w:tc>
+      </w:tr>
+      <w:tr>
+        <w:tc>
+          <w:tcPr>
+            <w:tcW w:type="dxa" w:w="2835"/>
+          </w:tcPr>
+          <w:p>
+            <w:pPr>
+              <w:bidi/>
+              <w:jc w:val="right"/>
+            </w:pPr>
+            <w:r>
+              <w:rPr>
+                <w:rFonts w:ascii="Arial" w:hAnsi="Arial"/>
+                <w:b/>
+                <w:sz w:val="20"/>
+                <w:rtl/>
+                <w:lang w:bidi="he-IL"/>
+              </w:rPr>
+              <w:t>Google Ads API, Meta API</w:t>
+            </w:r>
+          </w:p>
+        </w:tc>
+        <w:tc>
+          <w:tcPr>
+            <w:tcW w:type="dxa" w:w="2835"/>
+          </w:tcPr>
+          <w:p>
+            <w:pPr>
+              <w:bidi/>
+              <w:jc w:val="right"/>
+            </w:pPr>
+            <w:r>
+              <w:rPr>
+                <w:rFonts w:ascii="Arial" w:hAnsi="Arial"/>
+                <w:sz w:val="20"/>
+                <w:rtl/>
+                <w:lang w:bidi="he-IL"/>
+              </w:rPr>
+              <w:t>API calls מתשתית טאורוס</w:t>
+            </w:r>
+          </w:p>
+        </w:tc>
+        <w:tc>
+          <w:tcPr>
+            <w:tcW w:type="dxa" w:w="2835"/>
+          </w:tcPr>
+          <w:p>
+            <w:pPr>
+              <w:bidi/>
+              <w:jc w:val="right"/>
+            </w:pPr>
+            <w:r>
+              <w:rPr>
+                <w:rFonts w:ascii="Arial" w:hAnsi="Arial"/>
+                <w:sz w:val="20"/>
+                <w:rtl/>
+                <w:lang w:bidi="he-IL"/>
+              </w:rPr>
+              <w:t>טאורוס</w:t>
+            </w:r>
+          </w:p>
+        </w:tc>
+      </w:tr>
+      <w:tr>
+        <w:tc>
+          <w:tcPr>
+            <w:tcW w:type="dxa" w:w="2835"/>
+          </w:tcPr>
+          <w:p>
+            <w:pPr>
+              <w:bidi/>
+              <w:jc w:val="right"/>
+            </w:pPr>
+            <w:r>
+              <w:rPr>
+                <w:rFonts w:ascii="Arial" w:hAnsi="Arial"/>
+                <w:b/>
+                <w:sz w:val="20"/>
+                <w:rtl/>
+                <w:lang w:bidi="he-IL"/>
+              </w:rPr>
+              <w:t>אימות משתמשים (Clerk)</w:t>
+            </w:r>
+          </w:p>
+        </w:tc>
+        <w:tc>
+          <w:tcPr>
+            <w:tcW w:type="dxa" w:w="2835"/>
+          </w:tcPr>
+          <w:p>
+            <w:pPr>
+              <w:bidi/>
+              <w:jc w:val="right"/>
+            </w:pPr>
+            <w:r>
+              <w:rPr>
+                <w:rFonts w:ascii="Arial" w:hAnsi="Arial"/>
+                <w:sz w:val="20"/>
+                <w:rtl/>
+                <w:lang w:bidi="he-IL"/>
+              </w:rPr>
+              <w:t>שירות צד שלישי — חוזה עם טאורוס</w:t>
+            </w:r>
+          </w:p>
+        </w:tc>
+        <w:tc>
+          <w:tcPr>
+            <w:tcW w:type="dxa" w:w="2835"/>
+          </w:tcPr>
+          <w:p>
+            <w:pPr>
+              <w:bidi/>
+              <w:jc w:val="right"/>
+            </w:pPr>
+            <w:r>
+              <w:rPr>
+                <w:rFonts w:ascii="Arial" w:hAnsi="Arial"/>
+                <w:sz w:val="20"/>
+                <w:rtl/>
+                <w:lang w:bidi="he-IL"/>
+              </w:rPr>
+              <w:t>טאורוס</w:t>
+            </w:r>
+          </w:p>
+        </w:tc>
+      </w:tr>
+      <w:tr>
+        <w:tc>
+          <w:tcPr>
+            <w:tcW w:type="dxa" w:w="2835"/>
+          </w:tcPr>
+          <w:p>
+            <w:pPr>
+              <w:bidi/>
+              <w:jc w:val="right"/>
+            </w:pPr>
+            <w:r>
+              <w:rPr>
+                <w:rFonts w:ascii="Arial" w:hAnsi="Arial"/>
+                <w:b/>
+                <w:sz w:val="20"/>
+                <w:rtl/>
+                <w:lang w:bidi="he-IL"/>
+              </w:rPr>
+              <w:t>WhatsApp alerts (Twilio)</w:t>
+            </w:r>
+          </w:p>
+        </w:tc>
+        <w:tc>
+          <w:tcPr>
+            <w:tcW w:type="dxa" w:w="2835"/>
+          </w:tcPr>
+          <w:p>
+            <w:pPr>
+              <w:bidi/>
+              <w:jc w:val="right"/>
+            </w:pPr>
+            <w:r>
+              <w:rPr>
+                <w:rFonts w:ascii="Arial" w:hAnsi="Arial"/>
+                <w:sz w:val="20"/>
+                <w:rtl/>
+                <w:lang w:bidi="he-IL"/>
+              </w:rPr>
+              <w:t>שירות צד שלישי — חוזה עם טאורוס</w:t>
+            </w:r>
+          </w:p>
+        </w:tc>
+        <w:tc>
+          <w:tcPr>
+            <w:tcW w:type="dxa" w:w="2835"/>
+          </w:tcPr>
+          <w:p>
+            <w:pPr>
+              <w:bidi/>
+              <w:jc w:val="right"/>
+            </w:pPr>
+            <w:r>
+              <w:rPr>
+                <w:rFonts w:ascii="Arial" w:hAnsi="Arial"/>
+                <w:sz w:val="20"/>
+                <w:rtl/>
+                <w:lang w:bidi="he-IL"/>
+              </w:rPr>
+              <w:t>טאורוס</w:t>
+            </w:r>
+          </w:p>
+        </w:tc>
+      </w:tr>
+    </w:tbl>
+    <w:p/>
+    <w:p>
+      <w:pPr>
+        <w:spacing w:after="120"/>
+        <w:bidi/>
+        <w:jc w:val="right"/>
+      </w:pPr>
+      <w:r>
+        <w:rPr>
+          <w:rFonts w:ascii="Arial" w:hAnsi="Arial"/>
+          <w:b w:val="0"/>
+          <w:i w:val="0"/>
+          <w:sz w:val="22"/>
+          <w:rtl/>
+          <w:lang w:bidi="he-IL"/>
+        </w:rPr>
+        <w:t>המשמעות המשפטית: VIGMIS US LLC היא ישות שיווקית וגבייה בלבד. היא אינה מפעילה שרתים, אינה מחזיקה מסדי נתונים, ואינה בעלת כל טכנולוגיה. כל ה"מוצר" — מנוע הבינה המלאכותית, הממשק, והדאטה — פועלים תחת תשתית טאורוס ובבעלותה המלאה.</w:t>
+      </w:r>
+    </w:p>
+    <w:p>
       <w:r>
         <w:br w:type="page"/>
       </w:r>
@@ -2104,6 +2755,564 @@
     </w:p>
     <w:p>
       <w:pPr>
+        <w:pStyle w:val="Heading2"/>
+        <w:bidi/>
+        <w:jc w:val="right"/>
+      </w:pPr>
+      <w:r>
+        <w:rPr>
+          <w:rFonts w:ascii="Arial" w:hAnsi="Arial"/>
+          <w:rtl/>
+          <w:lang w:bidi="he-IL"/>
+        </w:rPr>
+        <w:t>7.3 מע"מ ומסי עקיפין (VAT / GST)</w:t>
+      </w:r>
+    </w:p>
+    <w:p>
+      <w:pPr>
+        <w:spacing w:after="120"/>
+        <w:bidi/>
+        <w:jc w:val="right"/>
+      </w:pPr>
+      <w:r>
+        <w:rPr>
+          <w:rFonts w:ascii="Arial" w:hAnsi="Arial"/>
+          <w:b w:val="0"/>
+          <w:i w:val="0"/>
+          <w:sz w:val="22"/>
+          <w:rtl/>
+          <w:lang w:bidi="he-IL"/>
+        </w:rPr>
+        <w:t>VIGMIS US LLC, כ-Merchant of Record, אחראית על גביית מע"מ מהלקוחות בהתאם לדין החל. הניהול מתבצע דרך Stripe Tax — חישוב, גביה, ודיווח אוטומטיים.</w:t>
+      </w:r>
+    </w:p>
+    <w:tbl>
+      <w:tblPr>
+        <w:tblStyle w:val="TableGrid"/>
+        <w:tblW w:type="auto" w:w="0"/>
+        <w:tblLook w:firstColumn="1" w:firstRow="1" w:lastColumn="0" w:lastRow="0" w:noHBand="0" w:noVBand="1" w:val="04A0"/>
+      </w:tblPr>
+      <w:tblGrid>
+        <w:gridCol w:w="2835"/>
+        <w:gridCol w:w="2835"/>
+        <w:gridCol w:w="2835"/>
+      </w:tblGrid>
+      <w:tr>
+        <w:tc>
+          <w:tcPr>
+            <w:tcW w:type="dxa" w:w="2835"/>
+          </w:tcPr>
+          <w:p>
+            <w:pPr>
+              <w:bidi/>
+              <w:jc w:val="right"/>
+            </w:pPr>
+            <w:r>
+              <w:rPr>
+                <w:rFonts w:ascii="Arial" w:hAnsi="Arial"/>
+                <w:b/>
+                <w:sz w:val="20"/>
+                <w:rtl/>
+                <w:lang w:bidi="he-IL"/>
+              </w:rPr>
+              <w:t>מדינה / אזור</w:t>
+            </w:r>
+          </w:p>
+        </w:tc>
+        <w:tc>
+          <w:tcPr>
+            <w:tcW w:type="dxa" w:w="2835"/>
+          </w:tcPr>
+          <w:p>
+            <w:pPr>
+              <w:bidi/>
+              <w:jc w:val="right"/>
+            </w:pPr>
+            <w:r>
+              <w:rPr>
+                <w:rFonts w:ascii="Arial" w:hAnsi="Arial"/>
+                <w:b/>
+                <w:sz w:val="20"/>
+                <w:rtl/>
+                <w:lang w:bidi="he-IL"/>
+              </w:rPr>
+              <w:t>מנגנון</w:t>
+            </w:r>
+          </w:p>
+        </w:tc>
+        <w:tc>
+          <w:tcPr>
+            <w:tcW w:type="dxa" w:w="2835"/>
+          </w:tcPr>
+          <w:p>
+            <w:pPr>
+              <w:bidi/>
+              <w:jc w:val="right"/>
+            </w:pPr>
+            <w:r>
+              <w:rPr>
+                <w:rFonts w:ascii="Arial" w:hAnsi="Arial"/>
+                <w:b/>
+                <w:sz w:val="20"/>
+                <w:rtl/>
+                <w:lang w:bidi="he-IL"/>
+              </w:rPr>
+              <w:t>הערה</w:t>
+            </w:r>
+          </w:p>
+        </w:tc>
+      </w:tr>
+      <w:tr>
+        <w:tc>
+          <w:tcPr>
+            <w:tcW w:type="dxa" w:w="2835"/>
+          </w:tcPr>
+          <w:p>
+            <w:pPr>
+              <w:bidi/>
+              <w:jc w:val="right"/>
+            </w:pPr>
+            <w:r>
+              <w:rPr>
+                <w:rFonts w:ascii="Arial" w:hAnsi="Arial"/>
+                <w:b/>
+                <w:sz w:val="20"/>
+                <w:rtl/>
+                <w:lang w:bidi="he-IL"/>
+              </w:rPr>
+              <w:t>ישראל</w:t>
+            </w:r>
+          </w:p>
+        </w:tc>
+        <w:tc>
+          <w:tcPr>
+            <w:tcW w:type="dxa" w:w="2835"/>
+          </w:tcPr>
+          <w:p>
+            <w:pPr>
+              <w:bidi/>
+              <w:jc w:val="right"/>
+            </w:pPr>
+            <w:r>
+              <w:rPr>
+                <w:rFonts w:ascii="Arial" w:hAnsi="Arial"/>
+                <w:sz w:val="20"/>
+                <w:rtl/>
+                <w:lang w:bidi="he-IL"/>
+              </w:rPr>
+              <w:t>מע"מ 18%</w:t>
+            </w:r>
+          </w:p>
+        </w:tc>
+        <w:tc>
+          <w:tcPr>
+            <w:tcW w:type="dxa" w:w="2835"/>
+          </w:tcPr>
+          <w:p>
+            <w:pPr>
+              <w:bidi/>
+              <w:jc w:val="right"/>
+            </w:pPr>
+            <w:r>
+              <w:rPr>
+                <w:rFonts w:ascii="Arial" w:hAnsi="Arial"/>
+                <w:sz w:val="20"/>
+                <w:rtl/>
+                <w:lang w:bidi="he-IL"/>
+              </w:rPr>
+              <w:t>לקוחות B2C ישראלים</w:t>
+            </w:r>
+          </w:p>
+        </w:tc>
+      </w:tr>
+      <w:tr>
+        <w:tc>
+          <w:tcPr>
+            <w:tcW w:type="dxa" w:w="2835"/>
+          </w:tcPr>
+          <w:p>
+            <w:pPr>
+              <w:bidi/>
+              <w:jc w:val="right"/>
+            </w:pPr>
+            <w:r>
+              <w:rPr>
+                <w:rFonts w:ascii="Arial" w:hAnsi="Arial"/>
+                <w:b/>
+                <w:sz w:val="20"/>
+                <w:rtl/>
+                <w:lang w:bidi="he-IL"/>
+              </w:rPr>
+              <w:t>האיחוד האירופי</w:t>
+            </w:r>
+          </w:p>
+        </w:tc>
+        <w:tc>
+          <w:tcPr>
+            <w:tcW w:type="dxa" w:w="2835"/>
+          </w:tcPr>
+          <w:p>
+            <w:pPr>
+              <w:bidi/>
+              <w:jc w:val="right"/>
+            </w:pPr>
+            <w:r>
+              <w:rPr>
+                <w:rFonts w:ascii="Arial" w:hAnsi="Arial"/>
+                <w:sz w:val="20"/>
+                <w:rtl/>
+                <w:lang w:bidi="he-IL"/>
+              </w:rPr>
+              <w:t>EU VAT OSS</w:t>
+            </w:r>
+          </w:p>
+        </w:tc>
+        <w:tc>
+          <w:tcPr>
+            <w:tcW w:type="dxa" w:w="2835"/>
+          </w:tcPr>
+          <w:p>
+            <w:pPr>
+              <w:bidi/>
+              <w:jc w:val="right"/>
+            </w:pPr>
+            <w:r>
+              <w:rPr>
+                <w:rFonts w:ascii="Arial" w:hAnsi="Arial"/>
+                <w:sz w:val="20"/>
+                <w:rtl/>
+                <w:lang w:bidi="he-IL"/>
+              </w:rPr>
+              <w:t>חובה מהלקוח הראשון — אין סף</w:t>
+            </w:r>
+          </w:p>
+        </w:tc>
+      </w:tr>
+      <w:tr>
+        <w:tc>
+          <w:tcPr>
+            <w:tcW w:type="dxa" w:w="2835"/>
+          </w:tcPr>
+          <w:p>
+            <w:pPr>
+              <w:bidi/>
+              <w:jc w:val="right"/>
+            </w:pPr>
+            <w:r>
+              <w:rPr>
+                <w:rFonts w:ascii="Arial" w:hAnsi="Arial"/>
+                <w:b/>
+                <w:sz w:val="20"/>
+                <w:rtl/>
+                <w:lang w:bidi="he-IL"/>
+              </w:rPr>
+              <w:t>בריטניה</w:t>
+            </w:r>
+          </w:p>
+        </w:tc>
+        <w:tc>
+          <w:tcPr>
+            <w:tcW w:type="dxa" w:w="2835"/>
+          </w:tcPr>
+          <w:p>
+            <w:pPr>
+              <w:bidi/>
+              <w:jc w:val="right"/>
+            </w:pPr>
+            <w:r>
+              <w:rPr>
+                <w:rFonts w:ascii="Arial" w:hAnsi="Arial"/>
+                <w:sz w:val="20"/>
+                <w:rtl/>
+                <w:lang w:bidi="he-IL"/>
+              </w:rPr>
+              <w:t>UK VAT 20%</w:t>
+            </w:r>
+          </w:p>
+        </w:tc>
+        <w:tc>
+          <w:tcPr>
+            <w:tcW w:type="dxa" w:w="2835"/>
+          </w:tcPr>
+          <w:p>
+            <w:pPr>
+              <w:bidi/>
+              <w:jc w:val="right"/>
+            </w:pPr>
+            <w:r>
+              <w:rPr>
+                <w:rFonts w:ascii="Arial" w:hAnsi="Arial"/>
+                <w:sz w:val="20"/>
+                <w:rtl/>
+                <w:lang w:bidi="he-IL"/>
+              </w:rPr>
+              <w:t>חובה עם לקוח ראשון</w:t>
+            </w:r>
+          </w:p>
+        </w:tc>
+      </w:tr>
+      <w:tr>
+        <w:tc>
+          <w:tcPr>
+            <w:tcW w:type="dxa" w:w="2835"/>
+          </w:tcPr>
+          <w:p>
+            <w:pPr>
+              <w:bidi/>
+              <w:jc w:val="right"/>
+            </w:pPr>
+            <w:r>
+              <w:rPr>
+                <w:rFonts w:ascii="Arial" w:hAnsi="Arial"/>
+                <w:b/>
+                <w:sz w:val="20"/>
+                <w:rtl/>
+                <w:lang w:bidi="he-IL"/>
+              </w:rPr>
+              <w:t>ארה"ב</w:t>
+            </w:r>
+          </w:p>
+        </w:tc>
+        <w:tc>
+          <w:tcPr>
+            <w:tcW w:type="dxa" w:w="2835"/>
+          </w:tcPr>
+          <w:p>
+            <w:pPr>
+              <w:bidi/>
+              <w:jc w:val="right"/>
+            </w:pPr>
+            <w:r>
+              <w:rPr>
+                <w:rFonts w:ascii="Arial" w:hAnsi="Arial"/>
+                <w:sz w:val="20"/>
+                <w:rtl/>
+                <w:lang w:bidi="he-IL"/>
+              </w:rPr>
+              <w:t>Sales Tax</w:t>
+            </w:r>
+          </w:p>
+        </w:tc>
+        <w:tc>
+          <w:tcPr>
+            <w:tcW w:type="dxa" w:w="2835"/>
+          </w:tcPr>
+          <w:p>
+            <w:pPr>
+              <w:bidi/>
+              <w:jc w:val="right"/>
+            </w:pPr>
+            <w:r>
+              <w:rPr>
+                <w:rFonts w:ascii="Arial" w:hAnsi="Arial"/>
+                <w:sz w:val="20"/>
+                <w:rtl/>
+                <w:lang w:bidi="he-IL"/>
+              </w:rPr>
+              <w:t>Nexus-based, Stripe Tax אוטומטי</w:t>
+            </w:r>
+          </w:p>
+        </w:tc>
+      </w:tr>
+      <w:tr>
+        <w:tc>
+          <w:tcPr>
+            <w:tcW w:type="dxa" w:w="2835"/>
+          </w:tcPr>
+          <w:p>
+            <w:pPr>
+              <w:bidi/>
+              <w:jc w:val="right"/>
+            </w:pPr>
+            <w:r>
+              <w:rPr>
+                <w:rFonts w:ascii="Arial" w:hAnsi="Arial"/>
+                <w:b/>
+                <w:sz w:val="20"/>
+                <w:rtl/>
+                <w:lang w:bidi="he-IL"/>
+              </w:rPr>
+              <w:t>קנדה</w:t>
+            </w:r>
+          </w:p>
+        </w:tc>
+        <w:tc>
+          <w:tcPr>
+            <w:tcW w:type="dxa" w:w="2835"/>
+          </w:tcPr>
+          <w:p>
+            <w:pPr>
+              <w:bidi/>
+              <w:jc w:val="right"/>
+            </w:pPr>
+            <w:r>
+              <w:rPr>
+                <w:rFonts w:ascii="Arial" w:hAnsi="Arial"/>
+                <w:sz w:val="20"/>
+                <w:rtl/>
+                <w:lang w:bidi="he-IL"/>
+              </w:rPr>
+              <w:t>GST/HST</w:t>
+            </w:r>
+          </w:p>
+        </w:tc>
+        <w:tc>
+          <w:tcPr>
+            <w:tcW w:type="dxa" w:w="2835"/>
+          </w:tcPr>
+          <w:p>
+            <w:pPr>
+              <w:bidi/>
+              <w:jc w:val="right"/>
+            </w:pPr>
+            <w:r>
+              <w:rPr>
+                <w:rFonts w:ascii="Arial" w:hAnsi="Arial"/>
+                <w:sz w:val="20"/>
+                <w:rtl/>
+                <w:lang w:bidi="he-IL"/>
+              </w:rPr>
+              <w:t>בהתאם לסף</w:t>
+            </w:r>
+          </w:p>
+        </w:tc>
+      </w:tr>
+      <w:tr>
+        <w:tc>
+          <w:tcPr>
+            <w:tcW w:type="dxa" w:w="2835"/>
+          </w:tcPr>
+          <w:p>
+            <w:pPr>
+              <w:bidi/>
+              <w:jc w:val="right"/>
+            </w:pPr>
+            <w:r>
+              <w:rPr>
+                <w:rFonts w:ascii="Arial" w:hAnsi="Arial"/>
+                <w:b/>
+                <w:sz w:val="20"/>
+                <w:rtl/>
+                <w:lang w:bidi="he-IL"/>
+              </w:rPr>
+              <w:t>אוסטרליה</w:t>
+            </w:r>
+          </w:p>
+        </w:tc>
+        <w:tc>
+          <w:tcPr>
+            <w:tcW w:type="dxa" w:w="2835"/>
+          </w:tcPr>
+          <w:p>
+            <w:pPr>
+              <w:bidi/>
+              <w:jc w:val="right"/>
+            </w:pPr>
+            <w:r>
+              <w:rPr>
+                <w:rFonts w:ascii="Arial" w:hAnsi="Arial"/>
+                <w:sz w:val="20"/>
+                <w:rtl/>
+                <w:lang w:bidi="he-IL"/>
+              </w:rPr>
+              <w:t>GST 10%</w:t>
+            </w:r>
+          </w:p>
+        </w:tc>
+        <w:tc>
+          <w:tcPr>
+            <w:tcW w:type="dxa" w:w="2835"/>
+          </w:tcPr>
+          <w:p>
+            <w:pPr>
+              <w:bidi/>
+              <w:jc w:val="right"/>
+            </w:pPr>
+            <w:r>
+              <w:rPr>
+                <w:rFonts w:ascii="Arial" w:hAnsi="Arial"/>
+                <w:sz w:val="20"/>
+                <w:rtl/>
+                <w:lang w:bidi="he-IL"/>
+              </w:rPr>
+              <w:t>בהתאם לסף</w:t>
+            </w:r>
+          </w:p>
+        </w:tc>
+      </w:tr>
+    </w:tbl>
+    <w:p/>
+    <w:p>
+      <w:pPr>
+        <w:spacing w:after="120"/>
+        <w:bidi/>
+        <w:jc w:val="right"/>
+      </w:pPr>
+      <w:r>
+        <w:rPr>
+          <w:rFonts w:ascii="Arial" w:hAnsi="Arial"/>
+          <w:b w:val="0"/>
+          <w:i w:val="0"/>
+          <w:sz w:val="22"/>
+          <w:rtl/>
+          <w:lang w:bidi="he-IL"/>
+        </w:rPr>
+        <w:t>EU VAT OSS — חובה מיידית: כחברה שאינה EU, חובה להירשם ל-VAT OSS לפני קבלת הלקוח האירופאי הראשון (מומלץ דרך אירלנד).</w:t>
+      </w:r>
+    </w:p>
+    <w:p>
+      <w:pPr>
+        <w:spacing w:after="120"/>
+        <w:bidi/>
+        <w:jc w:val="right"/>
+      </w:pPr>
+      <w:r>
+        <w:rPr>
+          <w:rFonts w:ascii="Arial" w:hAnsi="Arial"/>
+          <w:b w:val="0"/>
+          <w:i w:val="0"/>
+          <w:sz w:val="22"/>
+          <w:rtl/>
+          <w:lang w:bidi="he-IL"/>
+        </w:rPr>
+        <w:t>הפרדת אחריות: VIGMIS US אחראית על הגשת דוחות מע"מ; Stripe מחשב וגובה אוטומטית; טאורוס אינה מחויבת במע"מ כלפי לקוחות קצה (מוכרת שירות B2B ל-VIGMIS US בלבד).</w:t>
+      </w:r>
+    </w:p>
+    <w:p>
+      <w:pPr>
+        <w:pStyle w:val="Heading2"/>
+        <w:bidi/>
+        <w:jc w:val="right"/>
+      </w:pPr>
+      <w:r>
+        <w:rPr>
+          <w:rFonts w:ascii="Arial" w:hAnsi="Arial"/>
+          <w:rtl/>
+          <w:lang w:bidi="he-IL"/>
+        </w:rPr>
+        <w:t>7.4 Transfer Pricing</w:t>
+      </w:r>
+    </w:p>
+    <w:p>
+      <w:pPr>
+        <w:spacing w:after="120"/>
+        <w:bidi/>
+        <w:jc w:val="right"/>
+      </w:pPr>
+      <w:r>
+        <w:rPr>
+          <w:rFonts w:ascii="Arial" w:hAnsi="Arial"/>
+          <w:b w:val="0"/>
+          <w:i w:val="0"/>
+          <w:sz w:val="22"/>
+          <w:rtl/>
+          <w:lang w:bidi="he-IL"/>
+        </w:rPr>
+        <w:t>כל עסקה בין-חברתית חייבת להיות בתנאי שוק (Arm's Length). מסמך זה מהווה תיעוד ראשוני. עם גדילת ההכנסות, יש להכין Transfer Pricing Study מקצועי.</w:t>
+      </w:r>
+    </w:p>
+    <w:p>
+      <w:pPr>
         <w:pStyle w:val="Heading1"/>
         <w:bidi/>
         <w:jc w:val="right"/>

</xml_diff>